<commit_message>
web(downloads): fix official photo in printable CV files
</commit_message>
<xml_diff>
--- a/public/files/cv/en/cv-executive-henry-bory-prevez-en.docx
+++ b/public/files/cv/en/cv-executive-henry-bory-prevez-en.docx
@@ -2,151 +2,309 @@
 <file path=word/document.xml><?xml version="1.0" encoding="utf-8"?>
 <w:document xmlns:wpc="http://schemas.microsoft.com/office/word/2010/wordprocessingCanvas" xmlns:mo="http://schemas.microsoft.com/office/mac/office/2008/main" xmlns:mc="http://schemas.openxmlformats.org/markup-compatibility/2006" xmlns:mv="urn:schemas-microsoft-com:mac:vml" xmlns:o="urn:schemas-microsoft-com:office:office" xmlns:r="http://schemas.openxmlformats.org/officeDocument/2006/relationships" xmlns:m="http://schemas.openxmlformats.org/officeDocument/2006/math" xmlns:v="urn:schemas-microsoft-com:vml" xmlns:wp14="http://schemas.microsoft.com/office/word/2010/wordprocessingDrawing" xmlns:wp="http://schemas.openxmlformats.org/drawingml/2006/wordprocessingDrawing" xmlns:w10="urn:schemas-microsoft-com:office:word" xmlns:w="http://schemas.openxmlformats.org/wordprocessingml/2006/main" xmlns:w14="http://schemas.microsoft.com/office/word/2010/wordml" xmlns:wpg="http://schemas.microsoft.com/office/word/2010/wordprocessingGroup" xmlns:wpi="http://schemas.microsoft.com/office/word/2010/wordprocessingInk" xmlns:wne="http://schemas.microsoft.com/office/word/2006/wordml" xmlns:wps="http://schemas.microsoft.com/office/word/2010/wordprocessingShape" mc:Ignorable="w14 wp14">
   <w:body>
+    <w:tbl>
+      <w:tblPr>
+        <w:tblW w:type="auto" w:w="0"/>
+        <w:jc w:val="center"/>
+        <w:tblLayout w:type="fixed"/>
+        <w:tblLook w:firstColumn="1" w:firstRow="1" w:lastColumn="0" w:lastRow="0" w:noHBand="0" w:noVBand="1" w:val="04A0"/>
+      </w:tblPr>
+      <w:tblGrid>
+        <w:gridCol w:w="7488"/>
+        <w:gridCol w:w="2088"/>
+      </w:tblGrid>
+      <w:tr>
+        <w:tc>
+          <w:tcPr>
+            <w:tcW w:type="dxa" w:w="5256"/>
+            <w:vAlign w:val="center"/>
+            <w:tcBorders>
+              <w:top w:val="nil"/>
+              <w:left w:val="nil"/>
+              <w:bottom w:val="nil"/>
+              <w:right w:val="nil"/>
+            </w:tcBorders>
+          </w:tcPr>
+          <w:p>
+            <w:pPr>
+              <w:spacing w:after="40"/>
+            </w:pPr>
+            <w:r>
+              <w:rPr>
+                <w:b/>
+                <w:color w:val="1F2937"/>
+                <w:sz w:val="42"/>
+              </w:rPr>
+              <w:t>Dr. Henry Bory Prevez</w:t>
+            </w:r>
+          </w:p>
+          <w:p>
+            <w:pPr>
+              <w:spacing w:after="40"/>
+            </w:pPr>
+            <w:r>
+              <w:rPr>
+                <w:color w:val="4B5563"/>
+                <w:sz w:val="19"/>
+              </w:rPr>
+              <w:t>Full Professor · PhD in Automatic Control · Universidad de Oriente, Santiago de Cuba</w:t>
+            </w:r>
+          </w:p>
+          <w:p>
+            <w:pPr>
+              <w:spacing w:after="0"/>
+            </w:pPr>
+            <w:r>
+              <w:rPr>
+                <w:b/>
+                <w:color w:val="1A61A5"/>
+                <w:sz w:val="18"/>
+              </w:rPr>
+              <w:t>Automatic Control · Power Electronics · Renewable Energy · Scientific Software · Applied Modelling</w:t>
+            </w:r>
+          </w:p>
+        </w:tc>
+        <w:tc>
+          <w:tcPr>
+            <w:tcW w:type="dxa" w:w="5256"/>
+            <w:vAlign w:val="center"/>
+            <w:tcBorders>
+              <w:top w:val="nil"/>
+              <w:left w:val="nil"/>
+              <w:bottom w:val="nil"/>
+              <w:right w:val="nil"/>
+            </w:tcBorders>
+          </w:tcPr>
+          <w:p>
+            <w:pPr>
+              <w:jc w:val="right"/>
+            </w:pPr>
+            <w:r>
+              <w:drawing>
+                <wp:inline xmlns:a="http://schemas.openxmlformats.org/drawingml/2006/main" xmlns:pic="http://schemas.openxmlformats.org/drawingml/2006/picture">
+                  <wp:extent cx="1115568" cy="1394460"/>
+                  <wp:docPr id="1" name="Picture 1"/>
+                  <wp:cNvGraphicFramePr>
+                    <a:graphicFrameLocks noChangeAspect="1"/>
+                  </wp:cNvGraphicFramePr>
+                  <a:graphic>
+                    <a:graphicData uri="http://schemas.openxmlformats.org/drawingml/2006/picture">
+                      <pic:pic>
+                        <pic:nvPicPr>
+                          <pic:cNvPr id="0" name="hbp-cv-photo-official-v01.png"/>
+                          <pic:cNvPicPr/>
+                        </pic:nvPicPr>
+                        <pic:blipFill>
+                          <a:blip r:embed="rId9"/>
+                          <a:stretch>
+                            <a:fillRect/>
+                          </a:stretch>
+                        </pic:blipFill>
+                        <pic:spPr>
+                          <a:xfrm>
+                            <a:off x="0" y="0"/>
+                            <a:ext cx="1115568" cy="1394460"/>
+                          </a:xfrm>
+                          <a:prstGeom prst="rect"/>
+                        </pic:spPr>
+                      </pic:pic>
+                    </a:graphicData>
+                  </a:graphic>
+                </wp:inline>
+              </w:drawing>
+            </w:r>
+          </w:p>
+        </w:tc>
+      </w:tr>
+    </w:tbl>
     <w:p>
       <w:pPr>
-        <w:jc w:val="center"/>
+        <w:spacing w:after="20"/>
+      </w:pPr>
+    </w:p>
+    <w:p>
+      <w:pPr>
+        <w:spacing w:before="120" w:after="60"/>
       </w:pPr>
       <w:r>
         <w:rPr>
           <w:b/>
-          <w:sz w:val="40"/>
+          <w:color w:val="1A61A5"/>
+          <w:sz w:val="24"/>
         </w:rPr>
-        <w:t>Dr. Henry Bory Prevez</w:t>
+        <w:t>Executive profile</w:t>
       </w:r>
     </w:p>
     <w:p>
       <w:pPr>
-        <w:jc w:val="center"/>
+        <w:spacing w:after="80"/>
       </w:pPr>
       <w:r>
-        <w:t>Full Professor · PhD in Automatic Control · Universidad de Oriente, Santiago de Cuba</w:t>
-      </w:r>
-    </w:p>
-    <w:p>
-      <w:pPr>
-        <w:jc w:val="center"/>
-      </w:pPr>
-      <w:r>
-        <w:t>Automatic Control · Power Electronics · Renewable Energy · Scientific Software · Applied Modelling</w:t>
-      </w:r>
-    </w:p>
-    <w:p>
-      <w:pPr>
-        <w:pStyle w:val="Heading2"/>
-      </w:pPr>
-      <w:r>
-        <w:t>Executive profile</w:t>
-      </w:r>
-    </w:p>
-    <w:p>
-      <w:r>
+        <w:rPr>
+          <w:b w:val="0"/>
+          <w:sz w:val="19"/>
+        </w:rPr>
         <w:t>Full Professor and PhD in Automatic Control with university teaching experience since 2002. His academic and technological work connects advanced control, power electronics, isolated micro-hydropower systems, OTEC and ocean energy, scientific software, virtual laboratories and applied mathematical modelling.</w:t>
       </w:r>
     </w:p>
     <w:p>
       <w:pPr>
-        <w:pStyle w:val="Heading2"/>
+        <w:spacing w:before="120" w:after="60"/>
       </w:pPr>
       <w:r>
+        <w:rPr>
+          <w:b/>
+          <w:color w:val="1A61A5"/>
+          <w:sz w:val="24"/>
+        </w:rPr>
         <w:t>Core areas</w:t>
       </w:r>
     </w:p>
     <w:p>
       <w:pPr>
         <w:pStyle w:val="ListBullet"/>
-        <w:spacing w:after="40"/>
+        <w:spacing w:after="30"/>
+        <w:ind w:left="288" w:hanging="216"/>
       </w:pPr>
       <w:r>
+        <w:rPr>
+          <w:sz w:val="18"/>
+        </w:rPr>
         <w:t>Automatic control, advanced control, fuzzy control and model predictive control.</w:t>
       </w:r>
     </w:p>
     <w:p>
       <w:pPr>
         <w:pStyle w:val="ListBullet"/>
-        <w:spacing w:after="40"/>
+        <w:spacing w:after="30"/>
+        <w:ind w:left="288" w:hanging="216"/>
       </w:pPr>
       <w:r>
+        <w:rPr>
+          <w:sz w:val="18"/>
+        </w:rPr>
         <w:t>Power electronics, converters, electrical systems and frequency regulation.</w:t>
       </w:r>
     </w:p>
     <w:p>
       <w:pPr>
         <w:pStyle w:val="ListBullet"/>
-        <w:spacing w:after="40"/>
+        <w:spacing w:after="30"/>
+        <w:ind w:left="288" w:hanging="216"/>
       </w:pPr>
       <w:r>
+        <w:rPr>
+          <w:sz w:val="18"/>
+        </w:rPr>
         <w:t>Renewable energy systems: Pelton micro-hydropower, OTEC and ocean energy.</w:t>
       </w:r>
     </w:p>
     <w:p>
       <w:pPr>
         <w:pStyle w:val="ListBullet"/>
-        <w:spacing w:after="40"/>
+        <w:spacing w:after="30"/>
+        <w:ind w:left="288" w:hanging="216"/>
       </w:pPr>
       <w:r>
+        <w:rPr>
+          <w:sz w:val="18"/>
+        </w:rPr>
         <w:t>Modelling, simulation, system identification and digital signal processing.</w:t>
       </w:r>
     </w:p>
     <w:p>
       <w:pPr>
         <w:pStyle w:val="ListBullet"/>
-        <w:spacing w:after="40"/>
+        <w:spacing w:after="30"/>
+        <w:ind w:left="288" w:hanging="216"/>
       </w:pPr>
       <w:r>
+        <w:rPr>
+          <w:sz w:val="18"/>
+        </w:rPr>
         <w:t>Scientific and academic software for teaching and applied research.</w:t>
       </w:r>
     </w:p>
     <w:p>
       <w:pPr>
-        <w:pStyle w:val="Heading2"/>
+        <w:spacing w:before="120" w:after="60"/>
       </w:pPr>
       <w:r>
+        <w:rPr>
+          <w:b/>
+          <w:color w:val="1A61A5"/>
+          <w:sz w:val="24"/>
+        </w:rPr>
         <w:t>Selected academic and technological results</w:t>
       </w:r>
     </w:p>
     <w:p>
       <w:pPr>
         <w:pStyle w:val="ListBullet"/>
-        <w:spacing w:after="40"/>
+        <w:spacing w:after="30"/>
+        <w:ind w:left="288" w:hanging="216"/>
       </w:pPr>
       <w:r>
+        <w:rPr>
+          <w:sz w:val="18"/>
+        </w:rPr>
         <w:t>Participation in international projects such as CRECE and IRIS.</w:t>
       </w:r>
     </w:p>
     <w:p>
       <w:pPr>
         <w:pStyle w:val="ListBullet"/>
-        <w:spacing w:after="40"/>
+        <w:spacing w:after="30"/>
+        <w:ind w:left="288" w:hanging="216"/>
       </w:pPr>
       <w:r>
+        <w:rPr>
+          <w:sz w:val="18"/>
+        </w:rPr>
         <w:t>Scientific publications on micro-hydropower, power electronics, OTEC, COVID-19, educational software and computational biophysics.</w:t>
       </w:r>
     </w:p>
     <w:p>
       <w:pPr>
         <w:pStyle w:val="ListBullet"/>
-        <w:spacing w:after="40"/>
+        <w:spacing w:after="30"/>
+        <w:ind w:left="288" w:hanging="216"/>
       </w:pPr>
       <w:r>
+        <w:rPr>
+          <w:sz w:val="18"/>
+        </w:rPr>
         <w:t>Software and records associated with Niord, AnaRed, TabPer, Cal_Arr_Fre and Calc_Covid19.</w:t>
       </w:r>
     </w:p>
     <w:p>
       <w:pPr>
-        <w:pStyle w:val="Heading2"/>
+        <w:spacing w:before="120" w:after="60"/>
       </w:pPr>
       <w:r>
+        <w:rPr>
+          <w:b/>
+          <w:color w:val="1A61A5"/>
+          <w:sz w:val="24"/>
+        </w:rPr>
         <w:t>Recommended use</w:t>
       </w:r>
     </w:p>
     <w:p>
+      <w:pPr>
+        <w:spacing w:after="0"/>
+      </w:pPr>
       <w:r>
+        <w:rPr>
+          <w:b w:val="0"/>
+          <w:sz w:val="18"/>
+        </w:rPr>
         <w:t>Executive version for international cooperation, academic networking, project presentation and institutional first contact. For full academic evaluation, use the extended academic CV.</w:t>
       </w:r>
     </w:p>
     <w:sectPr>
       <w:pgSz w:w="12240" w:h="15840"/>
-      <w:pgMar w:top="792" w:right="936" w:bottom="792" w:left="936" w:header="720" w:footer="720" w:gutter="0"/>
+      <w:pgMar w:top="792" w:right="864" w:bottom="792" w:left="864" w:header="720" w:footer="720" w:gutter="0"/>
       <w:cols w:space="720"/>
       <w:docGrid w:linePitch="360"/>
     </w:sectPr>
@@ -518,7 +676,8 @@
     <w:qFormat/>
     <w:rsid w:val="00FC693F"/>
     <w:rPr>
-      <w:rFonts w:ascii="Arial" w:hAnsi="Arial"/>
+      <w:rFonts w:ascii="Arial" w:hAnsi="Arial" w:eastAsia="Arial"/>
+      <w:color w:val="1F2937"/>
       <w:sz w:val="19"/>
     </w:rPr>
   </w:style>
@@ -581,11 +740,11 @@
       <w:outlineLvl w:val="0"/>
     </w:pPr>
     <w:rPr>
-      <w:rFonts w:asciiTheme="majorHAnsi" w:eastAsiaTheme="majorEastAsia" w:hAnsiTheme="majorHAnsi" w:cstheme="majorBidi" w:ascii="Arial" w:hAnsi="Arial"/>
+      <w:rFonts w:asciiTheme="majorHAnsi" w:eastAsiaTheme="majorEastAsia" w:hAnsiTheme="majorHAnsi" w:cstheme="majorBidi"/>
       <w:b/>
       <w:bCs/>
       <w:color w:val="365F91" w:themeColor="accent1" w:themeShade="BF"/>
-      <w:sz w:val="36"/>
+      <w:sz w:val="28"/>
       <w:szCs w:val="28"/>
     </w:rPr>
   </w:style>
@@ -605,11 +764,11 @@
       <w:outlineLvl w:val="1"/>
     </w:pPr>
     <w:rPr>
-      <w:rFonts w:asciiTheme="majorHAnsi" w:eastAsiaTheme="majorEastAsia" w:hAnsiTheme="majorHAnsi" w:cstheme="majorBidi" w:ascii="Arial" w:hAnsi="Arial"/>
+      <w:rFonts w:asciiTheme="majorHAnsi" w:eastAsiaTheme="majorEastAsia" w:hAnsiTheme="majorHAnsi" w:cstheme="majorBidi"/>
       <w:b/>
       <w:bCs/>
       <w:color w:val="4F81BD" w:themeColor="accent1"/>
-      <w:sz w:val="24"/>
+      <w:sz w:val="26"/>
       <w:szCs w:val="26"/>
     </w:rPr>
   </w:style>
@@ -629,7 +788,7 @@
       <w:outlineLvl w:val="2"/>
     </w:pPr>
     <w:rPr>
-      <w:rFonts w:asciiTheme="majorHAnsi" w:eastAsiaTheme="majorEastAsia" w:hAnsiTheme="majorHAnsi" w:cstheme="majorBidi" w:ascii="Arial" w:hAnsi="Arial"/>
+      <w:rFonts w:asciiTheme="majorHAnsi" w:eastAsiaTheme="majorEastAsia" w:hAnsiTheme="majorHAnsi" w:cstheme="majorBidi"/>
       <w:b/>
       <w:bCs/>
       <w:color w:val="4F81BD" w:themeColor="accent1"/>
@@ -1050,6 +1209,10 @@
       </w:numPr>
       <w:contextualSpacing/>
     </w:pPr>
+    <w:rPr>
+      <w:rFonts w:ascii="Arial" w:hAnsi="Arial" w:eastAsia="Arial"/>
+      <w:sz w:val="18"/>
+    </w:rPr>
   </w:style>
   <w:style w:type="paragraph" w:styleId="ListBullet2">
     <w:name w:val="List Bullet 2"/>

</xml_diff>